<commit_message>
feat(branding): update website logo, horizontal header logo, and favicon set
</commit_message>
<xml_diff>
--- a/public/policies/03-pricing.docx
+++ b/public/policies/03-pricing.docx
@@ -60,6 +60,11 @@
       </w:pPr>
       <w:r>
         <w:t>1. Đơn vị tính và bảng giá</w:t>
+      </w:r>
+    </w:p>
+    <w:p>
+      <w:r>
+        <w:t xml:space="preserve">Hiện chức năng nạp lượt đang tạm khóa trong thời gian hoàn thiện thủ tục website. Chỉ thanh toán khi chức năng được mở chính thức; không chuyển tiền theo đề nghị ngoài luồng. </w:t>
       </w:r>
     </w:p>
     <w:p>

</xml_diff>